<commit_message>
Minor glyph rearrange in cheat sheet
</commit_message>
<xml_diff>
--- a/AstraLinguaCheatSheet/AstraLinguaCheatSheet.docx
+++ b/AstraLinguaCheatSheet/AstraLinguaCheatSheet.docx
@@ -947,9 +947,11 @@
       <w:r>
         <w:t>"</w:t>
       </w:r>
+      <w:proofErr w:type="spellStart"/>
       <w:r>
         <w:t>aaa</w:t>
       </w:r>
+      <w:proofErr w:type="spellEnd"/>
       <w:r>
         <w:t>"</w:t>
       </w:r>
@@ -998,9 +1000,11 @@
       <w:r>
         <w:t>"</w:t>
       </w:r>
+      <w:proofErr w:type="spellStart"/>
       <w:r>
         <w:t>i</w:t>
       </w:r>
+      <w:proofErr w:type="spellEnd"/>
       <w:r>
         <w:t>"</w:t>
       </w:r>
@@ -1048,7 +1052,15 @@
         <w:t xml:space="preserve">Konekomi prefer to use </w:t>
       </w:r>
       <w:r>
-        <w:t>the pitch of any vocal ("m", "n", "a", "e", "i", "o", "u", etc)</w:t>
+        <w:t>the pitch of any vocal ("m", "n", "a", "e", "</w:t>
+      </w:r>
+      <w:proofErr w:type="spellStart"/>
+      <w:r>
+        <w:t>i</w:t>
+      </w:r>
+      <w:proofErr w:type="spellEnd"/>
+      <w:r>
+        <w:t>", "o", "u", etc)</w:t>
       </w:r>
       <w:r>
         <w:t xml:space="preserve"> which allows them to hum or speak the language</w:t>
@@ -1142,7 +1154,7 @@
       </w:pPr>
       <w:r>
         <w:rPr>
-          <w:rFonts w:cs="Cambria Math"/>
+          <w:rFonts w:ascii="Cambria Math" w:hAnsi="Cambria Math" w:cs="Cambria Math"/>
         </w:rPr>
         <w:t>⊪</w:t>
       </w:r>
@@ -1156,7 +1168,7 @@
         </w:numPr>
       </w:pPr>
       <w:r>
-        <w:t>&gt;</w:t>
+        <w:t>[</w:t>
       </w:r>
     </w:p>
     <w:p>
@@ -1168,7 +1180,7 @@
         </w:numPr>
       </w:pPr>
       <w:r>
-        <w:t>[</w:t>
+        <w:t>&gt;</w:t>
       </w:r>
     </w:p>
     <w:p>
@@ -5255,6 +5267,7 @@
   <w:style w:type="character" w:default="1" w:styleId="DefaultParagraphFont">
     <w:name w:val="Default Paragraph Font"/>
     <w:uiPriority w:val="1"/>
+    <w:semiHidden/>
     <w:unhideWhenUsed/>
   </w:style>
   <w:style w:type="table" w:default="1" w:styleId="TableNormal">

</xml_diff>

<commit_message>
Add sign for no change
</commit_message>
<xml_diff>
--- a/AstraLinguaCheatSheet/AstraLinguaCheatSheet.docx
+++ b/AstraLinguaCheatSheet/AstraLinguaCheatSheet.docx
@@ -1097,10 +1097,21 @@
         <w:rPr>
           <w:rFonts w:cs="Cambria Math"/>
         </w:rPr>
-        <w:t>⊢⊢⊩⊪⊩</w:t>
-      </w:r>
-      <w:r>
-        <w:t>[" = 105</w:t>
+        <w:t>⊢⊢⊩⊪</w:t>
+      </w:r>
+      <w:proofErr w:type="gramStart"/>
+      <w:r>
+        <w:rPr>
+          <w:rFonts w:cs="Cambria Math"/>
+        </w:rPr>
+        <w:t>⊩</w:t>
+      </w:r>
+      <w:r>
+        <w:t>[</w:t>
+      </w:r>
+      <w:proofErr w:type="gramEnd"/>
+      <w:r>
+        <w:t>" = 105</w:t>
       </w:r>
     </w:p>
     <w:p>
@@ -1255,10 +1266,7 @@
         <w:t xml:space="preserve">One </w:t>
       </w:r>
       <w:r>
-        <w:t>D</w:t>
-      </w:r>
-      <w:r>
-        <w:t>irection</w:t>
+        <w:t>Direction</w:t>
       </w:r>
       <w:r>
         <w:t>, Rocket</w:t>
@@ -1328,7 +1336,13 @@
         <w:t>(</w:t>
       </w:r>
       <w:r>
-        <w:t>Two Direction</w:t>
+        <w:t xml:space="preserve">Two </w:t>
+      </w:r>
+      <w:r>
+        <w:t>Direction</w:t>
+      </w:r>
+      <w:r>
+        <w:t>s</w:t>
       </w:r>
       <w:r>
         <w:t xml:space="preserve">, </w:t>
@@ -1392,7 +1406,16 @@
         </w:drawing>
       </w:r>
       <w:r>
-        <w:t xml:space="preserve">  (Four Direction, Star)</w:t>
+        <w:t xml:space="preserve">  (Four </w:t>
+      </w:r>
+      <w:r>
+        <w:t>Direction</w:t>
+      </w:r>
+      <w:r>
+        <w:t>s</w:t>
+      </w:r>
+      <w:r>
+        <w:t>, Star)</w:t>
       </w:r>
     </w:p>
     <w:p>
@@ -1519,6 +1542,76 @@
     </w:p>
     <w:p>
       <w:pPr>
+        <w:pStyle w:val="ListParagraph"/>
+        <w:numPr>
+          <w:ilvl w:val="0"/>
+          <w:numId w:val="24"/>
+        </w:numPr>
+      </w:pPr>
+      <w:r>
+        <w:rPr>
+          <w:noProof/>
+        </w:rPr>
+        <w:drawing>
+          <wp:inline distT="0" distB="0" distL="0" distR="0" wp14:anchorId="38C770DB" wp14:editId="111E0AD1">
+            <wp:extent cx="156805" cy="156805"/>
+            <wp:effectExtent l="0" t="0" r="0" b="0"/>
+            <wp:docPr id="1983185451" name="Picture 1"/>
+            <wp:cNvGraphicFramePr>
+              <a:graphicFrameLocks xmlns:a="http://schemas.openxmlformats.org/drawingml/2006/main" noChangeAspect="1"/>
+            </wp:cNvGraphicFramePr>
+            <a:graphic xmlns:a="http://schemas.openxmlformats.org/drawingml/2006/main">
+              <a:graphicData uri="http://schemas.openxmlformats.org/drawingml/2006/picture">
+                <pic:pic xmlns:pic="http://schemas.openxmlformats.org/drawingml/2006/picture">
+                  <pic:nvPicPr>
+                    <pic:cNvPr id="1983185451" name="Picture 1"/>
+                    <pic:cNvPicPr/>
+                  </pic:nvPicPr>
+                  <pic:blipFill>
+                    <a:blip r:embed="rId12">
+                      <a:extLst>
+                        <a:ext uri="{28A0092B-C50C-407E-A947-70E740481C1C}">
+                          <a14:useLocalDpi xmlns:a14="http://schemas.microsoft.com/office/drawing/2010/main" val="0"/>
+                        </a:ext>
+                      </a:extLst>
+                    </a:blip>
+                    <a:stretch>
+                      <a:fillRect/>
+                    </a:stretch>
+                  </pic:blipFill>
+                  <pic:spPr>
+                    <a:xfrm>
+                      <a:off x="0" y="0"/>
+                      <a:ext cx="156805" cy="156805"/>
+                    </a:xfrm>
+                    <a:prstGeom prst="rect">
+                      <a:avLst/>
+                    </a:prstGeom>
+                  </pic:spPr>
+                </pic:pic>
+              </a:graphicData>
+            </a:graphic>
+          </wp:inline>
+        </w:drawing>
+      </w:r>
+      <w:r>
+        <w:t xml:space="preserve">  (</w:t>
+      </w:r>
+      <w:r>
+        <w:t>No Change</w:t>
+      </w:r>
+      <w:r>
+        <w:t xml:space="preserve">, </w:t>
+      </w:r>
+      <w:r>
+        <w:t>Hollow</w:t>
+      </w:r>
+      <w:r>
+        <w:t xml:space="preserve"> Circle)</w:t>
+      </w:r>
+    </w:p>
+    <w:p>
+      <w:pPr>
         <w:pStyle w:val="Heading2"/>
       </w:pPr>
       <w:r>
@@ -1723,12 +1816,12 @@
       </w:r>
     </w:p>
     <w:sectPr>
-      <w:headerReference w:type="even" r:id="rId12"/>
-      <w:headerReference w:type="default" r:id="rId13"/>
-      <w:footerReference w:type="even" r:id="rId14"/>
-      <w:footerReference w:type="default" r:id="rId15"/>
-      <w:headerReference w:type="first" r:id="rId16"/>
-      <w:footerReference w:type="first" r:id="rId17"/>
+      <w:headerReference w:type="even" r:id="rId13"/>
+      <w:headerReference w:type="default" r:id="rId14"/>
+      <w:footerReference w:type="even" r:id="rId15"/>
+      <w:footerReference w:type="default" r:id="rId16"/>
+      <w:headerReference w:type="first" r:id="rId17"/>
+      <w:footerReference w:type="first" r:id="rId18"/>
       <w:pgSz w:w="16838" w:h="11906" w:orient="landscape"/>
       <w:pgMar w:top="720" w:right="720" w:bottom="720" w:left="720" w:header="708" w:footer="708" w:gutter="0"/>
       <w:cols w:num="3" w:space="708"/>
@@ -1874,7 +1967,7 @@
         <v:path o:extrusionok="f" gradientshapeok="t" o:connecttype="rect"/>
         <o:lock v:ext="edit" aspectratio="t"/>
       </v:shapetype>
-      <v:shape id="Picture 1" o:spid="_x0000_i1025" type="#_x0000_t75" style="width:240pt;height:240pt;visibility:visible;mso-wrap-style:square" o:bullet="t">
+      <v:shape id="Picture 1" o:spid="_x0000_i1025" type="#_x0000_t75" style="width:240.2pt;height:240.2pt;visibility:visible;mso-wrap-style:square" o:bullet="t">
         <v:imagedata r:id="rId1" o:title=""/>
       </v:shape>
     </w:pict>

</xml_diff>

<commit_message>
Continue adding transliteration support
</commit_message>
<xml_diff>
--- a/AstraLinguaCheatSheet/AstraLinguaCheatSheet.docx
+++ b/AstraLinguaCheatSheet/AstraLinguaCheatSheet.docx
@@ -1048,6 +1048,110 @@
       </w:r>
     </w:p>
     <w:p>
+      <w:r>
+        <w:t xml:space="preserve">The official sounds for Konekomi are </w:t>
+      </w:r>
+      <w:r>
+        <w:t>"</w:t>
+      </w:r>
+      <w:r>
+        <w:t>u</w:t>
+      </w:r>
+      <w:r>
+        <w:t>"</w:t>
+      </w:r>
+      <w:r>
+        <w:t xml:space="preserve"> (low </w:t>
+      </w:r>
+      <w:r>
+        <w:t>"</w:t>
+      </w:r>
+      <w:r>
+        <w:t>a</w:t>
+      </w:r>
+      <w:r>
+        <w:t>"</w:t>
+      </w:r>
+      <w:r>
+        <w:t xml:space="preserve">), </w:t>
+      </w:r>
+      <w:r>
+        <w:t>"</w:t>
+      </w:r>
+      <w:r>
+        <w:t>o</w:t>
+      </w:r>
+      <w:r>
+        <w:t>"</w:t>
+      </w:r>
+      <w:r>
+        <w:t xml:space="preserve"> (medium </w:t>
+      </w:r>
+      <w:r>
+        <w:t>"</w:t>
+      </w:r>
+      <w:r>
+        <w:t>a</w:t>
+      </w:r>
+      <w:r>
+        <w:t>"</w:t>
+      </w:r>
+      <w:r>
+        <w:t xml:space="preserve">), </w:t>
+      </w:r>
+      <w:r>
+        <w:t>"</w:t>
+      </w:r>
+      <w:r>
+        <w:t>a</w:t>
+      </w:r>
+      <w:r>
+        <w:t>"</w:t>
+      </w:r>
+      <w:r>
+        <w:t xml:space="preserve"> (high </w:t>
+      </w:r>
+      <w:r>
+        <w:t>"</w:t>
+      </w:r>
+      <w:r>
+        <w:t>a</w:t>
+      </w:r>
+      <w:r>
+        <w:t>"</w:t>
+      </w:r>
+      <w:r>
+        <w:t xml:space="preserve">). They can also hum pitches of </w:t>
+      </w:r>
+      <w:r>
+        <w:t>"</w:t>
+      </w:r>
+      <w:r>
+        <w:t>m</w:t>
+      </w:r>
+      <w:r>
+        <w:t>"</w:t>
+      </w:r>
+      <w:r>
+        <w:t xml:space="preserve"> or </w:t>
+      </w:r>
+      <w:r>
+        <w:t>"</w:t>
+      </w:r>
+      <w:r>
+        <w:t>n</w:t>
+      </w:r>
+      <w:r>
+        <w:t>"</w:t>
+      </w:r>
+      <w:r>
+        <w:t>.</w:t>
+      </w:r>
+    </w:p>
+    <w:p>
+      <w:r>
+        <w:t>//</w:t>
+      </w:r>
       <w:r>
         <w:t xml:space="preserve">Konekomi prefer to use </w:t>
       </w:r>
@@ -1339,10 +1443,7 @@
         <w:t xml:space="preserve">Two </w:t>
       </w:r>
       <w:r>
-        <w:t>Direction</w:t>
-      </w:r>
-      <w:r>
-        <w:t>s</w:t>
+        <w:t>Directions</w:t>
       </w:r>
       <w:r>
         <w:t xml:space="preserve">, </w:t>
@@ -1409,10 +1510,7 @@
         <w:t xml:space="preserve">  (Four </w:t>
       </w:r>
       <w:r>
-        <w:t>Direction</w:t>
-      </w:r>
-      <w:r>
-        <w:t>s</w:t>
+        <w:t>Directions</w:t>
       </w:r>
       <w:r>
         <w:t>, Star)</w:t>
@@ -1595,19 +1693,7 @@
         </w:drawing>
       </w:r>
       <w:r>
-        <w:t xml:space="preserve">  (</w:t>
-      </w:r>
-      <w:r>
-        <w:t>No Change</w:t>
-      </w:r>
-      <w:r>
-        <w:t xml:space="preserve">, </w:t>
-      </w:r>
-      <w:r>
-        <w:t>Hollow</w:t>
-      </w:r>
-      <w:r>
-        <w:t xml:space="preserve"> Circle)</w:t>
+        <w:t xml:space="preserve">  (No Change, Hollow Circle)</w:t>
       </w:r>
     </w:p>
     <w:p>

</xml_diff>

<commit_message>
Add transliteration to cheat sheet
</commit_message>
<xml_diff>
--- a/AstraLinguaCheatSheet/AstraLinguaCheatSheet.docx
+++ b/AstraLinguaCheatSheet/AstraLinguaCheatSheet.docx
@@ -885,19 +885,34 @@
         <w:t xml:space="preserve">Some use </w:t>
       </w:r>
       <w:r>
-        <w:t xml:space="preserve">pitch (low </w:t>
+        <w:t>pitch (</w:t>
+      </w:r>
+      <w:r>
+        <w:t xml:space="preserve">high </w:t>
       </w:r>
       <w:r>
         <w:t>"a"</w:t>
       </w:r>
       <w:r>
-        <w:t xml:space="preserve">, medium </w:t>
+        <w:t>,</w:t>
+      </w:r>
+      <w:r>
+        <w:t xml:space="preserve"> </w:t>
+      </w:r>
+      <w:r>
+        <w:t xml:space="preserve">medium </w:t>
       </w:r>
       <w:r>
         <w:t>"a"</w:t>
       </w:r>
       <w:r>
-        <w:t xml:space="preserve">, high </w:t>
+        <w:t>,</w:t>
+      </w:r>
+      <w:r>
+        <w:t xml:space="preserve"> </w:t>
+      </w:r>
+      <w:r>
+        <w:t xml:space="preserve">low </w:t>
       </w:r>
       <w:r>
         <w:t>"a"</w:t>
@@ -923,10 +938,15 @@
       <w:r>
         <w:t>"</w:t>
       </w:r>
+      <w:proofErr w:type="spellStart"/>
       <w:r>
         <w:t>a</w:t>
       </w:r>
       <w:r>
+        <w:t>aa</w:t>
+      </w:r>
+      <w:proofErr w:type="spellEnd"/>
+      <w:r>
         <w:t>"</w:t>
       </w:r>
       <w:r>
@@ -947,11 +967,9 @@
       <w:r>
         <w:t>"</w:t>
       </w:r>
-      <w:proofErr w:type="spellStart"/>
-      <w:r>
-        <w:t>aaa</w:t>
-      </w:r>
-      <w:proofErr w:type="spellEnd"/>
+      <w:r>
+        <w:t>a</w:t>
+      </w:r>
       <w:r>
         <w:t>"</w:t>
       </w:r>
@@ -1052,16 +1070,22 @@
         <w:t xml:space="preserve">The official sounds for Konekomi are </w:t>
       </w:r>
       <w:r>
+        <w:t>"a" (high "a")</w:t>
+      </w:r>
+      <w:r>
+        <w:t xml:space="preserve">, </w:t>
+      </w:r>
+      <w:r>
         <w:t>"</w:t>
       </w:r>
       <w:r>
-        <w:t>u</w:t>
+        <w:t>o</w:t>
       </w:r>
       <w:r>
         <w:t>"</w:t>
       </w:r>
       <w:r>
-        <w:t xml:space="preserve"> (low </w:t>
+        <w:t xml:space="preserve"> (medium </w:t>
       </w:r>
       <w:r>
         <w:t>"</w:t>
@@ -1073,101 +1097,34 @@
         <w:t>"</w:t>
       </w:r>
       <w:r>
-        <w:t xml:space="preserve">), </w:t>
+        <w:t>),</w:t>
+      </w:r>
+      <w:r>
+        <w:t xml:space="preserve"> "u" (low "a")</w:t>
+      </w:r>
+      <w:r>
+        <w:t xml:space="preserve">. They can also hum pitches of </w:t>
       </w:r>
       <w:r>
         <w:t>"</w:t>
       </w:r>
       <w:r>
-        <w:t>o</w:t>
+        <w:t>m</w:t>
       </w:r>
       <w:r>
         <w:t>"</w:t>
       </w:r>
       <w:r>
-        <w:t xml:space="preserve"> (medium </w:t>
+        <w:t xml:space="preserve"> or </w:t>
       </w:r>
       <w:r>
         <w:t>"</w:t>
       </w:r>
       <w:r>
-        <w:t>a</w:t>
+        <w:t>n</w:t>
       </w:r>
       <w:r>
         <w:t>"</w:t>
-      </w:r>
-      <w:r>
-        <w:t xml:space="preserve">), </w:t>
-      </w:r>
-      <w:r>
-        <w:t>"</w:t>
-      </w:r>
-      <w:r>
-        <w:t>a</w:t>
-      </w:r>
-      <w:r>
-        <w:t>"</w:t>
-      </w:r>
-      <w:r>
-        <w:t xml:space="preserve"> (high </w:t>
-      </w:r>
-      <w:r>
-        <w:t>"</w:t>
-      </w:r>
-      <w:r>
-        <w:t>a</w:t>
-      </w:r>
-      <w:r>
-        <w:t>"</w:t>
-      </w:r>
-      <w:r>
-        <w:t xml:space="preserve">). They can also hum pitches of </w:t>
-      </w:r>
-      <w:r>
-        <w:t>"</w:t>
-      </w:r>
-      <w:r>
-        <w:t>m</w:t>
-      </w:r>
-      <w:r>
-        <w:t>"</w:t>
-      </w:r>
-      <w:r>
-        <w:t xml:space="preserve"> or </w:t>
-      </w:r>
-      <w:r>
-        <w:t>"</w:t>
-      </w:r>
-      <w:r>
-        <w:t>n</w:t>
-      </w:r>
-      <w:r>
-        <w:t>"</w:t>
-      </w:r>
-      <w:r>
-        <w:t>.</w:t>
-      </w:r>
-    </w:p>
-    <w:p>
-      <w:r>
-        <w:t>//</w:t>
-      </w:r>
-      <w:r>
-        <w:t xml:space="preserve">Konekomi prefer to use </w:t>
-      </w:r>
-      <w:r>
-        <w:t>the pitch of any vocal ("m", "n", "a", "e", "</w:t>
-      </w:r>
-      <w:proofErr w:type="spellStart"/>
-      <w:r>
-        <w:t>i</w:t>
-      </w:r>
-      <w:proofErr w:type="spellEnd"/>
-      <w:r>
-        <w:t>", "o", "u", etc)</w:t>
-      </w:r>
-      <w:r>
-        <w:t xml:space="preserve"> which allows them to hum or speak the language</w:t>
       </w:r>
       <w:r>
         <w:t>.</w:t>
@@ -1694,6 +1651,225 @@
       </w:r>
       <w:r>
         <w:t xml:space="preserve">  (No Change, Hollow Circle)</w:t>
+      </w:r>
+    </w:p>
+    <w:p>
+      <w:pPr>
+        <w:pStyle w:val="Heading2"/>
+      </w:pPr>
+      <w:r>
+        <w:t>Transliteration</w:t>
+      </w:r>
+    </w:p>
+    <w:p>
+      <w:r>
+        <w:t>The official transliteration</w:t>
+      </w:r>
+      <w:r>
+        <w:t xml:space="preserve"> symbols are:</w:t>
+      </w:r>
+    </w:p>
+    <w:p>
+      <w:pPr>
+        <w:pStyle w:val="ListParagraph"/>
+        <w:numPr>
+          <w:ilvl w:val="0"/>
+          <w:numId w:val="25"/>
+        </w:numPr>
+      </w:pPr>
+      <w:r>
+        <w:t>a (</w:t>
+      </w:r>
+      <w:r>
+        <w:rPr>
+          <w:rFonts w:ascii="Cambria Math" w:hAnsi="Cambria Math" w:cs="Cambria Math"/>
+        </w:rPr>
+        <w:t>⊢</w:t>
+      </w:r>
+      <w:r>
+        <w:rPr>
+          <w:rFonts w:cs="Cambria Math"/>
+        </w:rPr>
+        <w:t>)</w:t>
+      </w:r>
+    </w:p>
+    <w:p>
+      <w:pPr>
+        <w:pStyle w:val="ListParagraph"/>
+        <w:numPr>
+          <w:ilvl w:val="0"/>
+          <w:numId w:val="25"/>
+        </w:numPr>
+      </w:pPr>
+      <w:r>
+        <w:rPr>
+          <w:rFonts w:cs="Cambria Math"/>
+        </w:rPr>
+        <w:t>o (</w:t>
+      </w:r>
+      <w:r>
+        <w:rPr>
+          <w:rFonts w:ascii="Cambria Math" w:hAnsi="Cambria Math" w:cs="Cambria Math"/>
+        </w:rPr>
+        <w:t>⊩</w:t>
+      </w:r>
+      <w:r>
+        <w:rPr>
+          <w:rFonts w:cs="Cambria Math"/>
+        </w:rPr>
+        <w:t>)</w:t>
+      </w:r>
+    </w:p>
+    <w:p>
+      <w:pPr>
+        <w:pStyle w:val="ListParagraph"/>
+        <w:numPr>
+          <w:ilvl w:val="0"/>
+          <w:numId w:val="25"/>
+        </w:numPr>
+      </w:pPr>
+      <w:r>
+        <w:t>u (</w:t>
+      </w:r>
+      <w:r>
+        <w:rPr>
+          <w:rFonts w:ascii="Cambria Math" w:hAnsi="Cambria Math" w:cs="Cambria Math"/>
+        </w:rPr>
+        <w:t>⊪</w:t>
+      </w:r>
+      <w:r>
+        <w:t>)</w:t>
+      </w:r>
+    </w:p>
+    <w:p>
+      <w:pPr>
+        <w:pStyle w:val="ListParagraph"/>
+        <w:numPr>
+          <w:ilvl w:val="0"/>
+          <w:numId w:val="25"/>
+        </w:numPr>
+      </w:pPr>
+      <w:r>
+        <w:t>[…] ([…[)</w:t>
+      </w:r>
+    </w:p>
+    <w:p>
+      <w:pPr>
+        <w:pStyle w:val="ListParagraph"/>
+        <w:numPr>
+          <w:ilvl w:val="0"/>
+          <w:numId w:val="25"/>
+        </w:numPr>
+      </w:pPr>
+      <w:r>
+        <w:t>/ (</w:t>
+      </w:r>
+      <w:r>
+        <w:t>&gt;</w:t>
+      </w:r>
+      <w:r>
+        <w:t>)</w:t>
+      </w:r>
+    </w:p>
+    <w:p>
+      <w:pPr>
+        <w:pStyle w:val="ListParagraph"/>
+        <w:numPr>
+          <w:ilvl w:val="0"/>
+          <w:numId w:val="25"/>
+        </w:numPr>
+      </w:pPr>
+      <w:r>
+        <w:t>? (</w:t>
+      </w:r>
+      <w:r>
+        <w:t>–</w:t>
+      </w:r>
+      <w:r>
+        <w:t>)</w:t>
+      </w:r>
+    </w:p>
+    <w:p>
+      <w:pPr>
+        <w:pStyle w:val="ListParagraph"/>
+        <w:numPr>
+          <w:ilvl w:val="0"/>
+          <w:numId w:val="25"/>
+        </w:numPr>
+      </w:pPr>
+      <w:r>
+        <w:t>. (</w:t>
+      </w:r>
+      <w:r>
+        <w:t>=</w:t>
+      </w:r>
+      <w:r>
+        <w:t>)</w:t>
+      </w:r>
+    </w:p>
+    <w:p>
+      <w:pPr>
+        <w:pStyle w:val="ListParagraph"/>
+        <w:numPr>
+          <w:ilvl w:val="0"/>
+          <w:numId w:val="25"/>
+        </w:numPr>
+      </w:pPr>
+      <w:r>
+        <w:t>! (</w:t>
+      </w:r>
+      <w:r>
+        <w:t>≡</w:t>
+      </w:r>
+      <w:r>
+        <w:t>)</w:t>
+      </w:r>
+    </w:p>
+    <w:p>
+      <w:r>
+        <w:t>When transliterating, i</w:t>
+      </w:r>
+      <w:r>
+        <w:t>nsert spaces between words</w:t>
+      </w:r>
+      <w:r>
+        <w:t xml:space="preserve"> and add tones at the end of words</w:t>
+      </w:r>
+      <w:r>
+        <w:t>:</w:t>
+      </w:r>
+    </w:p>
+    <w:p>
+      <w:pPr>
+        <w:pStyle w:val="ListParagraph"/>
+        <w:numPr>
+          <w:ilvl w:val="0"/>
+          <w:numId w:val="27"/>
+        </w:numPr>
+      </w:pPr>
+      <w:r>
+        <w:t>"</w:t>
+      </w:r>
+      <w:proofErr w:type="spellStart"/>
+      <w:proofErr w:type="gramStart"/>
+      <w:r>
+        <w:t>aaoouu</w:t>
+      </w:r>
+      <w:proofErr w:type="spellEnd"/>
+      <w:proofErr w:type="gramEnd"/>
+      <w:r>
+        <w:t xml:space="preserve"> </w:t>
+      </w:r>
+      <w:proofErr w:type="spellStart"/>
+      <w:r>
+        <w:t>aaoauaaaaouo</w:t>
+      </w:r>
+      <w:proofErr w:type="spellEnd"/>
+      <w:r>
+        <w:t>!!</w:t>
+      </w:r>
+      <w:r>
+        <w:t>"</w:t>
       </w:r>
     </w:p>
     <w:p>
@@ -2172,6 +2348,119 @@
     </w:lvl>
   </w:abstractNum>
   <w:abstractNum w:abstractNumId="1" w15:restartNumberingAfterBreak="0">
+    <w:nsid w:val="02470B33"/>
+    <w:multiLevelType w:val="hybridMultilevel"/>
+    <w:tmpl w:val="BA4A3806"/>
+    <w:lvl w:ilvl="0" w:tplc="08090001">
+      <w:start w:val="1"/>
+      <w:numFmt w:val="bullet"/>
+      <w:lvlText w:val=""/>
+      <w:lvlJc w:val="left"/>
+      <w:pPr>
+        <w:ind w:left="720" w:hanging="360"/>
+      </w:pPr>
+      <w:rPr>
+        <w:rFonts w:ascii="Symbol" w:hAnsi="Symbol" w:hint="default"/>
+      </w:rPr>
+    </w:lvl>
+    <w:lvl w:ilvl="1" w:tplc="08090003" w:tentative="1">
+      <w:start w:val="1"/>
+      <w:numFmt w:val="bullet"/>
+      <w:lvlText w:val="o"/>
+      <w:lvlJc w:val="left"/>
+      <w:pPr>
+        <w:ind w:left="1440" w:hanging="360"/>
+      </w:pPr>
+      <w:rPr>
+        <w:rFonts w:ascii="Courier New" w:hAnsi="Courier New" w:cs="Courier New" w:hint="default"/>
+      </w:rPr>
+    </w:lvl>
+    <w:lvl w:ilvl="2" w:tplc="08090005" w:tentative="1">
+      <w:start w:val="1"/>
+      <w:numFmt w:val="bullet"/>
+      <w:lvlText w:val=""/>
+      <w:lvlJc w:val="left"/>
+      <w:pPr>
+        <w:ind w:left="2160" w:hanging="360"/>
+      </w:pPr>
+      <w:rPr>
+        <w:rFonts w:ascii="Wingdings" w:hAnsi="Wingdings" w:hint="default"/>
+      </w:rPr>
+    </w:lvl>
+    <w:lvl w:ilvl="3" w:tplc="08090001" w:tentative="1">
+      <w:start w:val="1"/>
+      <w:numFmt w:val="bullet"/>
+      <w:lvlText w:val=""/>
+      <w:lvlJc w:val="left"/>
+      <w:pPr>
+        <w:ind w:left="2880" w:hanging="360"/>
+      </w:pPr>
+      <w:rPr>
+        <w:rFonts w:ascii="Symbol" w:hAnsi="Symbol" w:hint="default"/>
+      </w:rPr>
+    </w:lvl>
+    <w:lvl w:ilvl="4" w:tplc="08090003" w:tentative="1">
+      <w:start w:val="1"/>
+      <w:numFmt w:val="bullet"/>
+      <w:lvlText w:val="o"/>
+      <w:lvlJc w:val="left"/>
+      <w:pPr>
+        <w:ind w:left="3600" w:hanging="360"/>
+      </w:pPr>
+      <w:rPr>
+        <w:rFonts w:ascii="Courier New" w:hAnsi="Courier New" w:cs="Courier New" w:hint="default"/>
+      </w:rPr>
+    </w:lvl>
+    <w:lvl w:ilvl="5" w:tplc="08090005" w:tentative="1">
+      <w:start w:val="1"/>
+      <w:numFmt w:val="bullet"/>
+      <w:lvlText w:val=""/>
+      <w:lvlJc w:val="left"/>
+      <w:pPr>
+        <w:ind w:left="4320" w:hanging="360"/>
+      </w:pPr>
+      <w:rPr>
+        <w:rFonts w:ascii="Wingdings" w:hAnsi="Wingdings" w:hint="default"/>
+      </w:rPr>
+    </w:lvl>
+    <w:lvl w:ilvl="6" w:tplc="08090001" w:tentative="1">
+      <w:start w:val="1"/>
+      <w:numFmt w:val="bullet"/>
+      <w:lvlText w:val=""/>
+      <w:lvlJc w:val="left"/>
+      <w:pPr>
+        <w:ind w:left="5040" w:hanging="360"/>
+      </w:pPr>
+      <w:rPr>
+        <w:rFonts w:ascii="Symbol" w:hAnsi="Symbol" w:hint="default"/>
+      </w:rPr>
+    </w:lvl>
+    <w:lvl w:ilvl="7" w:tplc="08090003" w:tentative="1">
+      <w:start w:val="1"/>
+      <w:numFmt w:val="bullet"/>
+      <w:lvlText w:val="o"/>
+      <w:lvlJc w:val="left"/>
+      <w:pPr>
+        <w:ind w:left="5760" w:hanging="360"/>
+      </w:pPr>
+      <w:rPr>
+        <w:rFonts w:ascii="Courier New" w:hAnsi="Courier New" w:cs="Courier New" w:hint="default"/>
+      </w:rPr>
+    </w:lvl>
+    <w:lvl w:ilvl="8" w:tplc="08090005" w:tentative="1">
+      <w:start w:val="1"/>
+      <w:numFmt w:val="bullet"/>
+      <w:lvlText w:val=""/>
+      <w:lvlJc w:val="left"/>
+      <w:pPr>
+        <w:ind w:left="6480" w:hanging="360"/>
+      </w:pPr>
+      <w:rPr>
+        <w:rFonts w:ascii="Wingdings" w:hAnsi="Wingdings" w:hint="default"/>
+      </w:rPr>
+    </w:lvl>
+  </w:abstractNum>
+  <w:abstractNum w:abstractNumId="2" w15:restartNumberingAfterBreak="0">
     <w:nsid w:val="06D24ABA"/>
     <w:multiLevelType w:val="hybridMultilevel"/>
     <w:tmpl w:val="25D230EC"/>
@@ -2284,7 +2573,7 @@
       </w:rPr>
     </w:lvl>
   </w:abstractNum>
-  <w:abstractNum w:abstractNumId="2" w15:restartNumberingAfterBreak="0">
+  <w:abstractNum w:abstractNumId="3" w15:restartNumberingAfterBreak="0">
     <w:nsid w:val="102D52A8"/>
     <w:multiLevelType w:val="hybridMultilevel"/>
     <w:tmpl w:val="8386528C"/>
@@ -2397,7 +2686,7 @@
       </w:rPr>
     </w:lvl>
   </w:abstractNum>
-  <w:abstractNum w:abstractNumId="3" w15:restartNumberingAfterBreak="0">
+  <w:abstractNum w:abstractNumId="4" w15:restartNumberingAfterBreak="0">
     <w:nsid w:val="11B73F21"/>
     <w:multiLevelType w:val="hybridMultilevel"/>
     <w:tmpl w:val="1C984FC4"/>
@@ -2510,7 +2799,7 @@
       </w:rPr>
     </w:lvl>
   </w:abstractNum>
-  <w:abstractNum w:abstractNumId="4" w15:restartNumberingAfterBreak="0">
+  <w:abstractNum w:abstractNumId="5" w15:restartNumberingAfterBreak="0">
     <w:nsid w:val="11EF3625"/>
     <w:multiLevelType w:val="hybridMultilevel"/>
     <w:tmpl w:val="D01A0BD4"/>
@@ -2623,7 +2912,7 @@
       </w:rPr>
     </w:lvl>
   </w:abstractNum>
-  <w:abstractNum w:abstractNumId="5" w15:restartNumberingAfterBreak="0">
+  <w:abstractNum w:abstractNumId="6" w15:restartNumberingAfterBreak="0">
     <w:nsid w:val="17095774"/>
     <w:multiLevelType w:val="hybridMultilevel"/>
     <w:tmpl w:val="B00ADCE0"/>
@@ -2736,7 +3025,7 @@
       </w:rPr>
     </w:lvl>
   </w:abstractNum>
-  <w:abstractNum w:abstractNumId="6" w15:restartNumberingAfterBreak="0">
+  <w:abstractNum w:abstractNumId="7" w15:restartNumberingAfterBreak="0">
     <w:nsid w:val="17123A68"/>
     <w:multiLevelType w:val="hybridMultilevel"/>
     <w:tmpl w:val="EB3637DE"/>
@@ -2849,7 +3138,7 @@
       </w:rPr>
     </w:lvl>
   </w:abstractNum>
-  <w:abstractNum w:abstractNumId="7" w15:restartNumberingAfterBreak="0">
+  <w:abstractNum w:abstractNumId="8" w15:restartNumberingAfterBreak="0">
     <w:nsid w:val="19685E14"/>
     <w:multiLevelType w:val="hybridMultilevel"/>
     <w:tmpl w:val="C22E08AE"/>
@@ -2962,7 +3251,7 @@
       </w:rPr>
     </w:lvl>
   </w:abstractNum>
-  <w:abstractNum w:abstractNumId="8" w15:restartNumberingAfterBreak="0">
+  <w:abstractNum w:abstractNumId="9" w15:restartNumberingAfterBreak="0">
     <w:nsid w:val="19DE0B1B"/>
     <w:multiLevelType w:val="hybridMultilevel"/>
     <w:tmpl w:val="9F06568C"/>
@@ -3075,7 +3364,7 @@
       </w:rPr>
     </w:lvl>
   </w:abstractNum>
-  <w:abstractNum w:abstractNumId="9" w15:restartNumberingAfterBreak="0">
+  <w:abstractNum w:abstractNumId="10" w15:restartNumberingAfterBreak="0">
     <w:nsid w:val="225F5E69"/>
     <w:multiLevelType w:val="hybridMultilevel"/>
     <w:tmpl w:val="6BEEF1EC"/>
@@ -3188,7 +3477,7 @@
       </w:rPr>
     </w:lvl>
   </w:abstractNum>
-  <w:abstractNum w:abstractNumId="10" w15:restartNumberingAfterBreak="0">
+  <w:abstractNum w:abstractNumId="11" w15:restartNumberingAfterBreak="0">
     <w:nsid w:val="24A9243E"/>
     <w:multiLevelType w:val="hybridMultilevel"/>
     <w:tmpl w:val="3A7AC5DE"/>
@@ -3301,7 +3590,7 @@
       </w:rPr>
     </w:lvl>
   </w:abstractNum>
-  <w:abstractNum w:abstractNumId="11" w15:restartNumberingAfterBreak="0">
+  <w:abstractNum w:abstractNumId="12" w15:restartNumberingAfterBreak="0">
     <w:nsid w:val="258E7AE1"/>
     <w:multiLevelType w:val="hybridMultilevel"/>
     <w:tmpl w:val="ABFE9928"/>
@@ -3414,7 +3703,7 @@
       </w:rPr>
     </w:lvl>
   </w:abstractNum>
-  <w:abstractNum w:abstractNumId="12" w15:restartNumberingAfterBreak="0">
+  <w:abstractNum w:abstractNumId="13" w15:restartNumberingAfterBreak="0">
     <w:nsid w:val="35635934"/>
     <w:multiLevelType w:val="hybridMultilevel"/>
     <w:tmpl w:val="BC6E781A"/>
@@ -3527,7 +3816,7 @@
       </w:rPr>
     </w:lvl>
   </w:abstractNum>
-  <w:abstractNum w:abstractNumId="13" w15:restartNumberingAfterBreak="0">
+  <w:abstractNum w:abstractNumId="14" w15:restartNumberingAfterBreak="0">
     <w:nsid w:val="3868204C"/>
     <w:multiLevelType w:val="hybridMultilevel"/>
     <w:tmpl w:val="8DA6A5DA"/>
@@ -3640,7 +3929,7 @@
       </w:rPr>
     </w:lvl>
   </w:abstractNum>
-  <w:abstractNum w:abstractNumId="14" w15:restartNumberingAfterBreak="0">
+  <w:abstractNum w:abstractNumId="15" w15:restartNumberingAfterBreak="0">
     <w:nsid w:val="3E4D4F63"/>
     <w:multiLevelType w:val="hybridMultilevel"/>
     <w:tmpl w:val="B03A0F10"/>
@@ -3753,7 +4042,7 @@
       </w:rPr>
     </w:lvl>
   </w:abstractNum>
-  <w:abstractNum w:abstractNumId="15" w15:restartNumberingAfterBreak="0">
+  <w:abstractNum w:abstractNumId="16" w15:restartNumberingAfterBreak="0">
     <w:nsid w:val="44E7260B"/>
     <w:multiLevelType w:val="hybridMultilevel"/>
     <w:tmpl w:val="4E86011E"/>
@@ -3866,7 +4155,7 @@
       </w:rPr>
     </w:lvl>
   </w:abstractNum>
-  <w:abstractNum w:abstractNumId="16" w15:restartNumberingAfterBreak="0">
+  <w:abstractNum w:abstractNumId="17" w15:restartNumberingAfterBreak="0">
     <w:nsid w:val="45E10CAE"/>
     <w:multiLevelType w:val="hybridMultilevel"/>
     <w:tmpl w:val="1CE03CD0"/>
@@ -3979,7 +4268,7 @@
       </w:rPr>
     </w:lvl>
   </w:abstractNum>
-  <w:abstractNum w:abstractNumId="17" w15:restartNumberingAfterBreak="0">
+  <w:abstractNum w:abstractNumId="18" w15:restartNumberingAfterBreak="0">
     <w:nsid w:val="4CC570BB"/>
     <w:multiLevelType w:val="hybridMultilevel"/>
     <w:tmpl w:val="AE6CEA92"/>
@@ -4092,7 +4381,120 @@
       </w:rPr>
     </w:lvl>
   </w:abstractNum>
-  <w:abstractNum w:abstractNumId="18" w15:restartNumberingAfterBreak="0">
+  <w:abstractNum w:abstractNumId="19" w15:restartNumberingAfterBreak="0">
+    <w:nsid w:val="55E03831"/>
+    <w:multiLevelType w:val="hybridMultilevel"/>
+    <w:tmpl w:val="FB385044"/>
+    <w:lvl w:ilvl="0" w:tplc="08090001">
+      <w:start w:val="1"/>
+      <w:numFmt w:val="bullet"/>
+      <w:lvlText w:val=""/>
+      <w:lvlJc w:val="left"/>
+      <w:pPr>
+        <w:ind w:left="720" w:hanging="360"/>
+      </w:pPr>
+      <w:rPr>
+        <w:rFonts w:ascii="Symbol" w:hAnsi="Symbol" w:hint="default"/>
+      </w:rPr>
+    </w:lvl>
+    <w:lvl w:ilvl="1" w:tplc="08090003" w:tentative="1">
+      <w:start w:val="1"/>
+      <w:numFmt w:val="bullet"/>
+      <w:lvlText w:val="o"/>
+      <w:lvlJc w:val="left"/>
+      <w:pPr>
+        <w:ind w:left="1440" w:hanging="360"/>
+      </w:pPr>
+      <w:rPr>
+        <w:rFonts w:ascii="Courier New" w:hAnsi="Courier New" w:cs="Courier New" w:hint="default"/>
+      </w:rPr>
+    </w:lvl>
+    <w:lvl w:ilvl="2" w:tplc="08090005" w:tentative="1">
+      <w:start w:val="1"/>
+      <w:numFmt w:val="bullet"/>
+      <w:lvlText w:val=""/>
+      <w:lvlJc w:val="left"/>
+      <w:pPr>
+        <w:ind w:left="2160" w:hanging="360"/>
+      </w:pPr>
+      <w:rPr>
+        <w:rFonts w:ascii="Wingdings" w:hAnsi="Wingdings" w:hint="default"/>
+      </w:rPr>
+    </w:lvl>
+    <w:lvl w:ilvl="3" w:tplc="08090001" w:tentative="1">
+      <w:start w:val="1"/>
+      <w:numFmt w:val="bullet"/>
+      <w:lvlText w:val=""/>
+      <w:lvlJc w:val="left"/>
+      <w:pPr>
+        <w:ind w:left="2880" w:hanging="360"/>
+      </w:pPr>
+      <w:rPr>
+        <w:rFonts w:ascii="Symbol" w:hAnsi="Symbol" w:hint="default"/>
+      </w:rPr>
+    </w:lvl>
+    <w:lvl w:ilvl="4" w:tplc="08090003" w:tentative="1">
+      <w:start w:val="1"/>
+      <w:numFmt w:val="bullet"/>
+      <w:lvlText w:val="o"/>
+      <w:lvlJc w:val="left"/>
+      <w:pPr>
+        <w:ind w:left="3600" w:hanging="360"/>
+      </w:pPr>
+      <w:rPr>
+        <w:rFonts w:ascii="Courier New" w:hAnsi="Courier New" w:cs="Courier New" w:hint="default"/>
+      </w:rPr>
+    </w:lvl>
+    <w:lvl w:ilvl="5" w:tplc="08090005" w:tentative="1">
+      <w:start w:val="1"/>
+      <w:numFmt w:val="bullet"/>
+      <w:lvlText w:val=""/>
+      <w:lvlJc w:val="left"/>
+      <w:pPr>
+        <w:ind w:left="4320" w:hanging="360"/>
+      </w:pPr>
+      <w:rPr>
+        <w:rFonts w:ascii="Wingdings" w:hAnsi="Wingdings" w:hint="default"/>
+      </w:rPr>
+    </w:lvl>
+    <w:lvl w:ilvl="6" w:tplc="08090001" w:tentative="1">
+      <w:start w:val="1"/>
+      <w:numFmt w:val="bullet"/>
+      <w:lvlText w:val=""/>
+      <w:lvlJc w:val="left"/>
+      <w:pPr>
+        <w:ind w:left="5040" w:hanging="360"/>
+      </w:pPr>
+      <w:rPr>
+        <w:rFonts w:ascii="Symbol" w:hAnsi="Symbol" w:hint="default"/>
+      </w:rPr>
+    </w:lvl>
+    <w:lvl w:ilvl="7" w:tplc="08090003" w:tentative="1">
+      <w:start w:val="1"/>
+      <w:numFmt w:val="bullet"/>
+      <w:lvlText w:val="o"/>
+      <w:lvlJc w:val="left"/>
+      <w:pPr>
+        <w:ind w:left="5760" w:hanging="360"/>
+      </w:pPr>
+      <w:rPr>
+        <w:rFonts w:ascii="Courier New" w:hAnsi="Courier New" w:cs="Courier New" w:hint="default"/>
+      </w:rPr>
+    </w:lvl>
+    <w:lvl w:ilvl="8" w:tplc="08090005" w:tentative="1">
+      <w:start w:val="1"/>
+      <w:numFmt w:val="bullet"/>
+      <w:lvlText w:val=""/>
+      <w:lvlJc w:val="left"/>
+      <w:pPr>
+        <w:ind w:left="6480" w:hanging="360"/>
+      </w:pPr>
+      <w:rPr>
+        <w:rFonts w:ascii="Wingdings" w:hAnsi="Wingdings" w:hint="default"/>
+      </w:rPr>
+    </w:lvl>
+  </w:abstractNum>
+  <w:abstractNum w:abstractNumId="20" w15:restartNumberingAfterBreak="0">
     <w:nsid w:val="5646093C"/>
     <w:multiLevelType w:val="hybridMultilevel"/>
     <w:tmpl w:val="CF8CB534"/>
@@ -4205,7 +4607,7 @@
       </w:rPr>
     </w:lvl>
   </w:abstractNum>
-  <w:abstractNum w:abstractNumId="19" w15:restartNumberingAfterBreak="0">
+  <w:abstractNum w:abstractNumId="21" w15:restartNumberingAfterBreak="0">
     <w:nsid w:val="609911A1"/>
     <w:multiLevelType w:val="hybridMultilevel"/>
     <w:tmpl w:val="E56AAFFA"/>
@@ -4318,7 +4720,7 @@
       </w:rPr>
     </w:lvl>
   </w:abstractNum>
-  <w:abstractNum w:abstractNumId="20" w15:restartNumberingAfterBreak="0">
+  <w:abstractNum w:abstractNumId="22" w15:restartNumberingAfterBreak="0">
     <w:nsid w:val="6B1E2DC3"/>
     <w:multiLevelType w:val="hybridMultilevel"/>
     <w:tmpl w:val="B86ECF40"/>
@@ -4431,7 +4833,7 @@
       </w:rPr>
     </w:lvl>
   </w:abstractNum>
-  <w:abstractNum w:abstractNumId="21" w15:restartNumberingAfterBreak="0">
+  <w:abstractNum w:abstractNumId="23" w15:restartNumberingAfterBreak="0">
     <w:nsid w:val="6BFD1796"/>
     <w:multiLevelType w:val="hybridMultilevel"/>
     <w:tmpl w:val="38069CD4"/>
@@ -4544,7 +4946,7 @@
       </w:rPr>
     </w:lvl>
   </w:abstractNum>
-  <w:abstractNum w:abstractNumId="22" w15:restartNumberingAfterBreak="0">
+  <w:abstractNum w:abstractNumId="24" w15:restartNumberingAfterBreak="0">
     <w:nsid w:val="6CE023B4"/>
     <w:multiLevelType w:val="hybridMultilevel"/>
     <w:tmpl w:val="649C0C56"/>
@@ -4657,7 +5059,120 @@
       </w:rPr>
     </w:lvl>
   </w:abstractNum>
-  <w:abstractNum w:abstractNumId="23" w15:restartNumberingAfterBreak="0">
+  <w:abstractNum w:abstractNumId="25" w15:restartNumberingAfterBreak="0">
+    <w:nsid w:val="6D4F4F43"/>
+    <w:multiLevelType w:val="hybridMultilevel"/>
+    <w:tmpl w:val="ECAAF4BA"/>
+    <w:lvl w:ilvl="0" w:tplc="08090001">
+      <w:start w:val="1"/>
+      <w:numFmt w:val="bullet"/>
+      <w:lvlText w:val=""/>
+      <w:lvlJc w:val="left"/>
+      <w:pPr>
+        <w:ind w:left="720" w:hanging="360"/>
+      </w:pPr>
+      <w:rPr>
+        <w:rFonts w:ascii="Symbol" w:hAnsi="Symbol" w:hint="default"/>
+      </w:rPr>
+    </w:lvl>
+    <w:lvl w:ilvl="1" w:tplc="08090003" w:tentative="1">
+      <w:start w:val="1"/>
+      <w:numFmt w:val="bullet"/>
+      <w:lvlText w:val="o"/>
+      <w:lvlJc w:val="left"/>
+      <w:pPr>
+        <w:ind w:left="1440" w:hanging="360"/>
+      </w:pPr>
+      <w:rPr>
+        <w:rFonts w:ascii="Courier New" w:hAnsi="Courier New" w:cs="Courier New" w:hint="default"/>
+      </w:rPr>
+    </w:lvl>
+    <w:lvl w:ilvl="2" w:tplc="08090005" w:tentative="1">
+      <w:start w:val="1"/>
+      <w:numFmt w:val="bullet"/>
+      <w:lvlText w:val=""/>
+      <w:lvlJc w:val="left"/>
+      <w:pPr>
+        <w:ind w:left="2160" w:hanging="360"/>
+      </w:pPr>
+      <w:rPr>
+        <w:rFonts w:ascii="Wingdings" w:hAnsi="Wingdings" w:hint="default"/>
+      </w:rPr>
+    </w:lvl>
+    <w:lvl w:ilvl="3" w:tplc="08090001" w:tentative="1">
+      <w:start w:val="1"/>
+      <w:numFmt w:val="bullet"/>
+      <w:lvlText w:val=""/>
+      <w:lvlJc w:val="left"/>
+      <w:pPr>
+        <w:ind w:left="2880" w:hanging="360"/>
+      </w:pPr>
+      <w:rPr>
+        <w:rFonts w:ascii="Symbol" w:hAnsi="Symbol" w:hint="default"/>
+      </w:rPr>
+    </w:lvl>
+    <w:lvl w:ilvl="4" w:tplc="08090003" w:tentative="1">
+      <w:start w:val="1"/>
+      <w:numFmt w:val="bullet"/>
+      <w:lvlText w:val="o"/>
+      <w:lvlJc w:val="left"/>
+      <w:pPr>
+        <w:ind w:left="3600" w:hanging="360"/>
+      </w:pPr>
+      <w:rPr>
+        <w:rFonts w:ascii="Courier New" w:hAnsi="Courier New" w:cs="Courier New" w:hint="default"/>
+      </w:rPr>
+    </w:lvl>
+    <w:lvl w:ilvl="5" w:tplc="08090005" w:tentative="1">
+      <w:start w:val="1"/>
+      <w:numFmt w:val="bullet"/>
+      <w:lvlText w:val=""/>
+      <w:lvlJc w:val="left"/>
+      <w:pPr>
+        <w:ind w:left="4320" w:hanging="360"/>
+      </w:pPr>
+      <w:rPr>
+        <w:rFonts w:ascii="Wingdings" w:hAnsi="Wingdings" w:hint="default"/>
+      </w:rPr>
+    </w:lvl>
+    <w:lvl w:ilvl="6" w:tplc="08090001" w:tentative="1">
+      <w:start w:val="1"/>
+      <w:numFmt w:val="bullet"/>
+      <w:lvlText w:val=""/>
+      <w:lvlJc w:val="left"/>
+      <w:pPr>
+        <w:ind w:left="5040" w:hanging="360"/>
+      </w:pPr>
+      <w:rPr>
+        <w:rFonts w:ascii="Symbol" w:hAnsi="Symbol" w:hint="default"/>
+      </w:rPr>
+    </w:lvl>
+    <w:lvl w:ilvl="7" w:tplc="08090003" w:tentative="1">
+      <w:start w:val="1"/>
+      <w:numFmt w:val="bullet"/>
+      <w:lvlText w:val="o"/>
+      <w:lvlJc w:val="left"/>
+      <w:pPr>
+        <w:ind w:left="5760" w:hanging="360"/>
+      </w:pPr>
+      <w:rPr>
+        <w:rFonts w:ascii="Courier New" w:hAnsi="Courier New" w:cs="Courier New" w:hint="default"/>
+      </w:rPr>
+    </w:lvl>
+    <w:lvl w:ilvl="8" w:tplc="08090005" w:tentative="1">
+      <w:start w:val="1"/>
+      <w:numFmt w:val="bullet"/>
+      <w:lvlText w:val=""/>
+      <w:lvlJc w:val="left"/>
+      <w:pPr>
+        <w:ind w:left="6480" w:hanging="360"/>
+      </w:pPr>
+      <w:rPr>
+        <w:rFonts w:ascii="Wingdings" w:hAnsi="Wingdings" w:hint="default"/>
+      </w:rPr>
+    </w:lvl>
+  </w:abstractNum>
+  <w:abstractNum w:abstractNumId="26" w15:restartNumberingAfterBreak="0">
     <w:nsid w:val="77DA297C"/>
     <w:multiLevelType w:val="hybridMultilevel"/>
     <w:tmpl w:val="74CE5BFE"/>
@@ -4771,76 +5286,85 @@
     </w:lvl>
   </w:abstractNum>
   <w:num w:numId="1" w16cid:durableId="2039816631">
-    <w:abstractNumId w:val="11"/>
+    <w:abstractNumId w:val="12"/>
   </w:num>
   <w:num w:numId="2" w16cid:durableId="1468352670">
-    <w:abstractNumId w:val="1"/>
+    <w:abstractNumId w:val="2"/>
   </w:num>
   <w:num w:numId="3" w16cid:durableId="425611286">
-    <w:abstractNumId w:val="9"/>
+    <w:abstractNumId w:val="10"/>
   </w:num>
   <w:num w:numId="4" w16cid:durableId="1216814940">
-    <w:abstractNumId w:val="17"/>
+    <w:abstractNumId w:val="18"/>
   </w:num>
   <w:num w:numId="5" w16cid:durableId="556816936">
-    <w:abstractNumId w:val="23"/>
+    <w:abstractNumId w:val="26"/>
   </w:num>
   <w:num w:numId="6" w16cid:durableId="1247955425">
     <w:abstractNumId w:val="0"/>
   </w:num>
   <w:num w:numId="7" w16cid:durableId="1815635154">
+    <w:abstractNumId w:val="4"/>
+  </w:num>
+  <w:num w:numId="8" w16cid:durableId="1002975844">
+    <w:abstractNumId w:val="23"/>
+  </w:num>
+  <w:num w:numId="9" w16cid:durableId="2088378710">
+    <w:abstractNumId w:val="5"/>
+  </w:num>
+  <w:num w:numId="10" w16cid:durableId="1442721897">
+    <w:abstractNumId w:val="22"/>
+  </w:num>
+  <w:num w:numId="11" w16cid:durableId="1377125200">
+    <w:abstractNumId w:val="9"/>
+  </w:num>
+  <w:num w:numId="12" w16cid:durableId="1171023576">
+    <w:abstractNumId w:val="17"/>
+  </w:num>
+  <w:num w:numId="13" w16cid:durableId="997003605">
+    <w:abstractNumId w:val="8"/>
+  </w:num>
+  <w:num w:numId="14" w16cid:durableId="1572498102">
+    <w:abstractNumId w:val="11"/>
+  </w:num>
+  <w:num w:numId="15" w16cid:durableId="1200896936">
+    <w:abstractNumId w:val="21"/>
+  </w:num>
+  <w:num w:numId="16" w16cid:durableId="1504277830">
+    <w:abstractNumId w:val="16"/>
+  </w:num>
+  <w:num w:numId="17" w16cid:durableId="709457975">
+    <w:abstractNumId w:val="6"/>
+  </w:num>
+  <w:num w:numId="18" w16cid:durableId="1387145226">
+    <w:abstractNumId w:val="14"/>
+  </w:num>
+  <w:num w:numId="19" w16cid:durableId="1831825249">
+    <w:abstractNumId w:val="15"/>
+  </w:num>
+  <w:num w:numId="20" w16cid:durableId="980615658">
     <w:abstractNumId w:val="3"/>
   </w:num>
-  <w:num w:numId="8" w16cid:durableId="1002975844">
-    <w:abstractNumId w:val="21"/>
-  </w:num>
-  <w:num w:numId="9" w16cid:durableId="2088378710">
-    <w:abstractNumId w:val="4"/>
-  </w:num>
-  <w:num w:numId="10" w16cid:durableId="1442721897">
+  <w:num w:numId="21" w16cid:durableId="72630911">
     <w:abstractNumId w:val="20"/>
   </w:num>
-  <w:num w:numId="11" w16cid:durableId="1377125200">
-    <w:abstractNumId w:val="8"/>
+  <w:num w:numId="22" w16cid:durableId="1319724484">
+    <w:abstractNumId w:val="24"/>
   </w:num>
-  <w:num w:numId="12" w16cid:durableId="1171023576">
-    <w:abstractNumId w:val="16"/>
+  <w:num w:numId="23" w16cid:durableId="1359744718">
+    <w:abstractNumId w:val="13"/>
   </w:num>
-  <w:num w:numId="13" w16cid:durableId="997003605">
+  <w:num w:numId="24" w16cid:durableId="899562830">
     <w:abstractNumId w:val="7"/>
   </w:num>
-  <w:num w:numId="14" w16cid:durableId="1572498102">
-    <w:abstractNumId w:val="10"/>
+  <w:num w:numId="25" w16cid:durableId="102069745">
+    <w:abstractNumId w:val="25"/>
   </w:num>
-  <w:num w:numId="15" w16cid:durableId="1200896936">
+  <w:num w:numId="26" w16cid:durableId="759642481">
     <w:abstractNumId w:val="19"/>
   </w:num>
-  <w:num w:numId="16" w16cid:durableId="1504277830">
-    <w:abstractNumId w:val="15"/>
-  </w:num>
-  <w:num w:numId="17" w16cid:durableId="709457975">
-    <w:abstractNumId w:val="5"/>
-  </w:num>
-  <w:num w:numId="18" w16cid:durableId="1387145226">
-    <w:abstractNumId w:val="13"/>
-  </w:num>
-  <w:num w:numId="19" w16cid:durableId="1831825249">
-    <w:abstractNumId w:val="14"/>
-  </w:num>
-  <w:num w:numId="20" w16cid:durableId="980615658">
-    <w:abstractNumId w:val="2"/>
-  </w:num>
-  <w:num w:numId="21" w16cid:durableId="72630911">
-    <w:abstractNumId w:val="18"/>
-  </w:num>
-  <w:num w:numId="22" w16cid:durableId="1319724484">
-    <w:abstractNumId w:val="22"/>
-  </w:num>
-  <w:num w:numId="23" w16cid:durableId="1359744718">
-    <w:abstractNumId w:val="12"/>
-  </w:num>
-  <w:num w:numId="24" w16cid:durableId="899562830">
-    <w:abstractNumId w:val="6"/>
+  <w:num w:numId="27" w16cid:durableId="1104494522">
+    <w:abstractNumId w:val="1"/>
   </w:num>
 </w:numbering>
 </file>

</xml_diff>